<commit_message>
Update progress log with git setup and local startup
</commit_message>
<xml_diff>
--- a/working_progress.docx
+++ b/working_progress.docx
@@ -425,6 +425,29 @@
         <w:t>----------------------------------------</w:t>
       </w:r>
     </w:p>
+    <w:p>
+      <w:r>
+        <w:rPr>
+          <w:b/>
+          <w:color w:val="0066CC"/>
+          <w:sz w:val="26"/>
+        </w:rPr>
+        <w:t>[2026-07-17 20:20:07] - Liên kết Git và Khởi chạy Hệ thống</w:t>
+      </w:r>
+    </w:p>
+    <w:p>
+      <w:r>
+        <w:rPr>
+          <w:sz w:val="22"/>
+        </w:rPr>
+        <w:t>Đã liên kết thành công Git remote tới kho lưu trữ https://github.com/LeNhatQuynh-2380601882/AI_TAO_VIDEO_TU_DONG.git. Đã đẩy toàn bộ mã nguồn lên nhánh chính (main) thành công. Đồng thời đã khởi chạy thành công API Backend (cổng 8000) và Dashboard Frontend (cổng 3000) dưới nền để sẵn sàng chạy thử nghiệm.</w:t>
+      </w:r>
+    </w:p>
+    <w:p>
+      <w:r>
+        <w:t>----------------------------------------</w:t>
+      </w:r>
+    </w:p>
     <w:sectPr>
       <w:pgSz w:w="12240" w:h="15840"/>
       <w:pgMar w:top="1440" w:right="1800" w:bottom="1440" w:left="1800" w:header="720" w:footer="720" w:gutter="0"/>

</xml_diff>